<commit_message>
docs(eyal): green invoice action sheet for Eyal + docx in CEO package
Made-with: Cursor
</commit_message>
<xml_diff>
--- a/docs/project/eyal-ceo-submissions-and-responses/to-eyal/2026-03-30--final-spec-package-for-eyal/2026-03-30--for-eyal-choices-v1.2--v2-final.docx
+++ b/docs/project/eyal-ceo-submissions-and-responses/to-eyal/2026-03-30--final-spec-package-for-eyal/2026-03-30--for-eyal-choices-v1.2--v2-final.docx
@@ -381,7 +381,7 @@
           <w:b/>
           <w:sz w:val="24"/>
         </w:rPr>
-        <w:t>2. חשבונית ירוקה — אופציות מוצר (אחרי מחקר)</w:t>
+        <w:t>2. חשבונית ירוקה (Morning) — מסלול סליקה</w:t>
       </w:r>
     </w:p>
     <w:p>
@@ -395,7 +395,7 @@
           <w:b w:val="0"/>
           <w:sz w:val="22"/>
         </w:rPr>
-        <w:t>סטטוס: מחקר יכולות רץ בנפרד. לאחר שיימסרו תוצאות — יוצגו כאן אופציות ישימות ספציפיות (גרסה 1.2.1 / נספח).</w:t>
+        <w:t>מסמך פעולה לאייל (תקציר + בדיקות מול Morning + דוגמה לפיתוח): `FOR-EYAL-GREEN-INVOICE-ACTION-SHEET-2026-03-30.md` — להגשה ב־Word/PDF (מיוצא מ־`build_eyal_ceo_deliverables.py`).</w:t>
       </w:r>
     </w:p>
     <w:p>
@@ -409,7 +409,119 @@
           <w:b w:val="0"/>
           <w:sz w:val="22"/>
         </w:rPr>
-        <w:t>כרגע: אין לסמן כאן — רק לידיעה: באתר יוצג קטלוג (תוכן + כפתור לסליקה חיצונית).</w:t>
+        <w:t>מחקר: הושלם — פירוט מלא ב־`../team-100-preplanning/GREEN-INVOICE-CAPABILITIES-FINDINGS-2026-03-30.md` (מנוי Best+ לרוב קישורי התשלום; API/Woo לשלב עומק).</w:t>
+      </w:r>
+    </w:p>
+    <w:p>
+      <w:pPr>
+        <w:jc w:val="right"/>
+      </w:pPr>
+      <w:r>
+        <w:rPr>
+          <w:rFonts w:ascii="Arial" w:hAnsi="Arial" w:cs="Arial"/>
+          <w:rFonts w:ascii="Arial" w:hAnsi="Arial"/>
+          <w:b w:val="0"/>
+          <w:sz w:val="22"/>
+        </w:rPr>
+        <w:t>באתר WordPress: נשאר קטלוג — עמוד מוצר = תוכן + כפתור ליעד חיצוני (לינק / דף מכירה Morning).</w:t>
+      </w:r>
+    </w:p>
+    <w:p>
+      <w:pPr>
+        <w:jc w:val="right"/>
+      </w:pPr>
+      <w:r>
+        <w:rPr>
+          <w:rFonts w:ascii="Arial" w:hAnsi="Arial" w:cs="Arial"/>
+          <w:rFonts w:ascii="Arial" w:hAnsi="Arial"/>
+          <w:b w:val="0"/>
+          <w:sz w:val="22"/>
+        </w:rPr>
+        <w:t>| אפשרות | תיאור קצר |</w:t>
+      </w:r>
+    </w:p>
+    <w:p>
+      <w:pPr>
+        <w:jc w:val="right"/>
+      </w:pPr>
+      <w:r>
+        <w:rPr>
+          <w:rFonts w:ascii="Arial" w:hAnsi="Arial" w:cs="Arial"/>
+          <w:rFonts w:ascii="Arial" w:hAnsi="Arial"/>
+          <w:b w:val="0"/>
+          <w:sz w:val="22"/>
+        </w:rPr>
+        <w:t>|--------|-----------|</w:t>
+      </w:r>
+    </w:p>
+    <w:p>
+      <w:pPr>
+        <w:jc w:val="right"/>
+      </w:pPr>
+      <w:r>
+        <w:rPr>
+          <w:rFonts w:ascii="Arial" w:hAnsi="Arial" w:cs="Arial"/>
+          <w:rFonts w:ascii="Arial" w:hAnsi="Arial"/>
+          <w:b w:val="0"/>
+          <w:sz w:val="22"/>
+        </w:rPr>
+        <w:t>| א | קישורי תשלום מ־Morning (סכום קבוע / פתוח / הוראת קבע) — כפתור או לינק מכל עמוד מוצר. |</w:t>
+      </w:r>
+    </w:p>
+    <w:p>
+      <w:pPr>
+        <w:jc w:val="right"/>
+      </w:pPr>
+      <w:r>
+        <w:rPr>
+          <w:rFonts w:ascii="Arial" w:hAnsi="Arial" w:cs="Arial"/>
+          <w:rFonts w:ascii="Arial" w:hAnsi="Arial"/>
+          <w:b w:val="0"/>
+          <w:sz w:val="22"/>
+        </w:rPr>
+        <w:t>| ב | דף מכירה / דף נחיתה hosted ב־Morning — קטלוג/מוצרים שם; באתר קישורים אל הדף או למוצר. |</w:t>
+      </w:r>
+    </w:p>
+    <w:p>
+      <w:pPr>
+        <w:jc w:val="right"/>
+      </w:pPr>
+      <w:r>
+        <w:rPr>
+          <w:rFonts w:ascii="Arial" w:hAnsi="Arial" w:cs="Arial"/>
+          <w:rFonts w:ascii="Arial" w:hAnsi="Arial"/>
+          <w:b w:val="0"/>
+          <w:sz w:val="22"/>
+        </w:rPr>
+        <w:t>| ג | שילוב: חלק מהמוצרים לינק ישיר, חלק לדף מכירה — לפרט: _________________________ |</w:t>
+      </w:r>
+    </w:p>
+    <w:p>
+      <w:pPr>
+        <w:jc w:val="right"/>
+      </w:pPr>
+      <w:r>
+        <w:rPr>
+          <w:rFonts w:ascii="Arial" w:hAnsi="Arial" w:cs="Arial"/>
+          <w:rFonts w:ascii="Arial" w:hAnsi="Arial"/>
+          <w:b w:val="0"/>
+          <w:sz w:val="22"/>
+        </w:rPr>
+        <w:t>שלב עומק (לא לסמן כברירת מחדל): API + Webhooks + WooCommerce — רק אם רלוונטי בעתיד ומנוי מאפשר — לתאם עם נימרוד.</w:t>
+      </w:r>
+    </w:p>
+    <w:p>
+      <w:pPr>
+        <w:jc w:val="right"/>
+      </w:pPr>
+      <w:r>
+        <w:rPr>
+          <w:rFonts w:ascii="Arial" w:hAnsi="Arial" w:cs="Arial"/>
+          <w:rFonts w:ascii="Arial" w:hAnsi="Arial"/>
+          <w:b w:val="0"/>
+          <w:sz w:val="22"/>
+        </w:rPr>
+        <w:t>בחירתי (מסלול ראשי): ☐ א ☐ ב ☐ ג</w:t>
       </w:r>
     </w:p>
     <w:p>

</xml_diff>